<commit_message>
docs: preserve user review update to ChpIII v2.docx
</commit_message>
<xml_diff>
--- a/thesis_docs/manuscripts/ChpIII v2.docx
+++ b/thesis_docs/manuscripts/ChpIII v2.docx
@@ -6,6 +6,7 @@
       <w:pPr>
         <w:spacing w:after="0" w:line="480" w:lineRule="auto"/>
         <w:contextualSpacing/>
+        <w:jc w:val="center"/>
         <w:outlineLvl w:val="0"/>
         <w:rPr>
           <w:rFonts w:ascii="Times New Roman" w:eastAsia="Times New Roman" w:hAnsi="Times New Roman" w:cs="Times New Roman"/>
@@ -299,7 +300,27 @@
           <w:kern w:val="0"/>
           <w14:ligatures w14:val="none"/>
         </w:rPr>
-        <w:t>The study uses an exploratory, sequential, quantitative design to systematically assess the predictive accuracy and operational utility of distinct forecasting approaches for passenger flow forecasting at airport security checkpoints. While this study evaluates a broad range of frameworks—including static deterministic baselines—it asserts that to truly optimize checkpoint flows, terminal subsystems (i.e., check-in, security screening, and boarding concourses) must ultimately be treated as a stochastic queuing network capable of absorbing dynamic, schedule-driven variability (De Neufville &amp; Odoni, 2014).</w:t>
+        <w:t xml:space="preserve">The study uses an exploratory, sequential, quantitative design to systematically assess the predictive accuracy and operational utility of distinct forecasting approaches for passenger flow forecasting at airport security checkpoints. While this study evaluates a broad range of frameworks—including static deterministic baselines—it asserts that to truly optimize checkpoint flows, terminal subsystems (i.e., check-in, security screening, and boarding concourses) must ultimately be treated as a stochastic queuing network capable of absorbing dynamic, schedule-driven variability (De Neufville &amp; </w:t>
+      </w:r>
+      <w:proofErr w:type="spellStart"/>
+      <w:r>
+        <w:rPr>
+          <w:rFonts w:ascii="Times New Roman" w:eastAsia="Times New Roman" w:hAnsi="Times New Roman" w:cs="Times New Roman"/>
+          <w:color w:val="000000" w:themeColor="text1"/>
+          <w:kern w:val="0"/>
+          <w14:ligatures w14:val="none"/>
+        </w:rPr>
+        <w:t>Odoni</w:t>
+      </w:r>
+      <w:proofErr w:type="spellEnd"/>
+      <w:r>
+        <w:rPr>
+          <w:rFonts w:ascii="Times New Roman" w:eastAsia="Times New Roman" w:hAnsi="Times New Roman" w:cs="Times New Roman"/>
+          <w:color w:val="000000" w:themeColor="text1"/>
+          <w:kern w:val="0"/>
+          <w14:ligatures w14:val="none"/>
+        </w:rPr>
+        <w:t>, 2014).</w:t>
       </w:r>
     </w:p>
     <w:p>
@@ -860,6 +881,9 @@
             </m:den>
           </m:f>
           <m:r>
+            <m:rPr>
+              <m:sty m:val="p"/>
+            </m:rPr>
             <w:rPr>
               <w:rFonts w:ascii="Times New Roman" w:eastAsia="Times New Roman" w:hAnsi="Times New Roman" w:cs="Times New Roman"/>
               <w:color w:val="000000" w:themeColor="text1"/>
@@ -2593,6 +2617,7 @@
         </w:rPr>
         <w:t>: Under nominal operating conditions (</w:t>
       </w:r>
+      <w:proofErr w:type="spellStart"/>
       <m:oMath>
         <m:r>
           <m:rPr>
@@ -2606,6 +2631,7 @@
           </w:rPr>
           <m:t>DepDelay</m:t>
         </m:r>
+        <w:proofErr w:type="spellEnd"/>
         <m:r>
           <w:rPr>
             <w:rFonts w:ascii="Cambria Math" w:eastAsia="Times New Roman" w:hAnsi="Cambria Math" w:cs="Times New Roman"/>
@@ -3076,6 +3102,7 @@
         </w:rPr>
         <w:t>: Under severe operational disruptions (</w:t>
       </w:r>
+      <w:proofErr w:type="spellStart"/>
       <m:oMath>
         <m:r>
           <m:rPr>
@@ -3089,6 +3116,7 @@
           </w:rPr>
           <m:t>DepDelay</m:t>
         </m:r>
+        <w:proofErr w:type="spellEnd"/>
         <m:r>
           <w:rPr>
             <w:rFonts w:ascii="Cambria Math" w:eastAsia="Times New Roman" w:hAnsi="Cambria Math" w:cs="Times New Roman"/>
@@ -8215,6 +8243,9 @@
             <m:t> minutes</m:t>
           </m:r>
           <m:r>
+            <m:rPr>
+              <m:sty m:val="p"/>
+            </m:rPr>
             <w:rPr>
               <w:rFonts w:ascii="Times New Roman" w:eastAsia="Times New Roman" w:hAnsi="Times New Roman" w:cs="Times New Roman"/>
               <w:color w:val="000000" w:themeColor="text1"/>
@@ -8624,6 +8655,9 @@
             </m:e>
           </m:d>
           <m:r>
+            <m:rPr>
+              <m:sty m:val="p"/>
+            </m:rPr>
             <w:rPr>
               <w:rFonts w:ascii="Times New Roman" w:eastAsia="Times New Roman" w:hAnsi="Times New Roman" w:cs="Times New Roman"/>
               <w:color w:val="000000" w:themeColor="text1"/>
@@ -9428,6 +9462,7 @@
           <w14:ligatures w14:val="none"/>
         </w:rPr>
       </w:pPr>
+      <w:proofErr w:type="spellStart"/>
       <w:r>
         <w:rPr>
           <w:rFonts w:ascii="Times New Roman" w:eastAsia="Times New Roman" w:hAnsi="Times New Roman" w:cs="Times New Roman"/>
@@ -9438,7 +9473,19 @@
           <w14:ligatures w14:val="none"/>
         </w:rPr>
         <w:lastRenderedPageBreak/>
-        <w:t>Meso Filter: Airspace Shock Invariance and Southwest Exclusion</w:t>
+        <w:t>Meso</w:t>
+      </w:r>
+      <w:proofErr w:type="spellEnd"/>
+      <w:r>
+        <w:rPr>
+          <w:rFonts w:ascii="Times New Roman" w:eastAsia="Times New Roman" w:hAnsi="Times New Roman" w:cs="Times New Roman"/>
+          <w:b/>
+          <w:bCs/>
+          <w:color w:val="000000" w:themeColor="text1"/>
+          <w:kern w:val="0"/>
+          <w14:ligatures w14:val="none"/>
+        </w:rPr>
+        <w:t xml:space="preserve"> Filter: Airspace Shock Invariance and Southwest Exclusion</w:t>
       </w:r>
       <w:r>
         <w:rPr>
@@ -10606,7 +10653,27 @@
           <w:kern w:val="0"/>
           <w14:ligatures w14:val="none"/>
         </w:rPr>
-        <w:t>Construct validity is affected by checkpoint heterogeneity, as raw lane counts obtained from TSA throughput data combine different screening modes, such as TSA PreCheck, with standard screening lanes, each exhibiting disparate processing rates (</w:t>
+        <w:t xml:space="preserve">Construct validity is affected by checkpoint heterogeneity, as raw lane counts obtained from TSA throughput data combine different screening modes, such as TSA </w:t>
+      </w:r>
+      <w:proofErr w:type="spellStart"/>
+      <w:r>
+        <w:rPr>
+          <w:rFonts w:ascii="Times New Roman" w:eastAsia="Times New Roman" w:hAnsi="Times New Roman" w:cs="Times New Roman"/>
+          <w:color w:val="000000" w:themeColor="text1"/>
+          <w:kern w:val="0"/>
+          <w14:ligatures w14:val="none"/>
+        </w:rPr>
+        <w:t>PreCheck</w:t>
+      </w:r>
+      <w:proofErr w:type="spellEnd"/>
+      <w:r>
+        <w:rPr>
+          <w:rFonts w:ascii="Times New Roman" w:eastAsia="Times New Roman" w:hAnsi="Times New Roman" w:cs="Times New Roman"/>
+          <w:color w:val="000000" w:themeColor="text1"/>
+          <w:kern w:val="0"/>
+          <w14:ligatures w14:val="none"/>
+        </w:rPr>
+        <w:t>, with standard screening lanes, each exhibiting disparate processing rates (</w:t>
       </w:r>
       <m:oMath>
         <m:r>
@@ -11241,6 +11308,9 @@
             </m:e>
           </m:rad>
           <m:r>
+            <m:rPr>
+              <m:sty m:val="p"/>
+            </m:rPr>
             <w:rPr>
               <w:rFonts w:ascii="Times New Roman" w:eastAsia="Times New Roman" w:hAnsi="Times New Roman" w:cs="Times New Roman"/>
               <w:color w:val="000000" w:themeColor="text1"/>
@@ -12013,6 +12083,9 @@
             </m:den>
           </m:f>
           <m:r>
+            <m:rPr>
+              <m:sty m:val="p"/>
+            </m:rPr>
             <w:rPr>
               <w:rFonts w:ascii="Times New Roman" w:eastAsia="Times New Roman" w:hAnsi="Times New Roman" w:cs="Times New Roman"/>
               <w:color w:val="000000" w:themeColor="text1"/>
@@ -12488,6 +12561,9 @@
             </m:e>
           </m:rad>
           <m:r>
+            <m:rPr>
+              <m:sty m:val="p"/>
+            </m:rPr>
             <w:rPr>
               <w:rFonts w:ascii="Times New Roman" w:eastAsia="Times New Roman" w:hAnsi="Times New Roman" w:cs="Times New Roman"/>
               <w:color w:val="000000" w:themeColor="text1"/>
@@ -13024,6 +13100,9 @@
             </m:e>
           </m:rad>
           <m:r>
+            <m:rPr>
+              <m:sty m:val="p"/>
+            </m:rPr>
             <w:rPr>
               <w:rFonts w:ascii="Times New Roman" w:eastAsia="Times New Roman" w:hAnsi="Times New Roman" w:cs="Times New Roman"/>
               <w:color w:val="000000" w:themeColor="text1"/>
@@ -13233,6 +13312,9 @@
             </m:sub>
           </m:sSub>
           <m:r>
+            <m:rPr>
+              <m:sty m:val="p"/>
+            </m:rPr>
             <w:rPr>
               <w:rFonts w:ascii="Times New Roman" w:eastAsia="Times New Roman" w:hAnsi="Times New Roman" w:cs="Times New Roman"/>
               <w:color w:val="000000" w:themeColor="text1"/>
@@ -14293,6 +14375,9 @@
             </m:e>
           </m:func>
           <m:r>
+            <m:rPr>
+              <m:sty m:val="p"/>
+            </m:rPr>
             <w:rPr>
               <w:rFonts w:ascii="Times New Roman" w:eastAsia="Times New Roman" w:hAnsi="Times New Roman" w:cs="Times New Roman"/>
               <w:color w:val="000000" w:themeColor="text1"/>
@@ -14905,6 +14990,7 @@
         </w:rPr>
         <w:t>Spatial entity resolution: Map upstream corrupted airport strings; assign unidentifiable strings to a dedicated null surrogate key (</w:t>
       </w:r>
+      <w:proofErr w:type="spellStart"/>
       <w:r>
         <w:rPr>
           <w:rFonts w:ascii="Times New Roman" w:eastAsia="Times New Roman" w:hAnsi="Times New Roman" w:cs="Times New Roman"/>
@@ -14916,6 +15002,7 @@
         </w:rPr>
         <w:t>airportId</w:t>
       </w:r>
+      <w:proofErr w:type="spellEnd"/>
       <w:r>
         <w:rPr>
           <w:rFonts w:ascii="Times New Roman" w:eastAsia="Times New Roman" w:hAnsi="Times New Roman" w:cs="Times New Roman"/>
@@ -14925,6 +15012,7 @@
         </w:rPr>
         <w:t> = 0, </w:t>
       </w:r>
+      <w:proofErr w:type="spellStart"/>
       <w:r>
         <w:rPr>
           <w:rFonts w:ascii="Times New Roman" w:eastAsia="Times New Roman" w:hAnsi="Times New Roman" w:cs="Times New Roman"/>
@@ -14936,6 +15024,7 @@
         </w:rPr>
         <w:t>airportMissing</w:t>
       </w:r>
+      <w:proofErr w:type="spellEnd"/>
       <w:r>
         <w:rPr>
           <w:rFonts w:ascii="Times New Roman" w:eastAsia="Times New Roman" w:hAnsi="Times New Roman" w:cs="Times New Roman"/>
@@ -15219,7 +15308,47 @@
           <w14:ligatures w14:val="none"/>
         </w:rPr>
         <w:lastRenderedPageBreak/>
-        <w:t>ing_7d_mean), Delays (avg_dep_delay_minutes, flights_delayed_15min_pct), Surface Queues (avg_taxi_out_minutes), and Network Buffers (aircraft_gauge_seats, route_load_factor_pct, connecting_passenger_share_pct).</w:t>
+        <w:t>ing_7d_mean), Delays (</w:t>
+      </w:r>
+      <w:proofErr w:type="spellStart"/>
+      <w:r>
+        <w:rPr>
+          <w:rFonts w:ascii="Times New Roman" w:eastAsia="Times New Roman" w:hAnsi="Times New Roman" w:cs="Times New Roman"/>
+          <w:color w:val="000000" w:themeColor="text1"/>
+          <w:kern w:val="0"/>
+          <w14:ligatures w14:val="none"/>
+        </w:rPr>
+        <w:t>avg_dep_delay_minutes</w:t>
+      </w:r>
+      <w:proofErr w:type="spellEnd"/>
+      <w:r>
+        <w:rPr>
+          <w:rFonts w:ascii="Times New Roman" w:eastAsia="Times New Roman" w:hAnsi="Times New Roman" w:cs="Times New Roman"/>
+          <w:color w:val="000000" w:themeColor="text1"/>
+          <w:kern w:val="0"/>
+          <w14:ligatures w14:val="none"/>
+        </w:rPr>
+        <w:t>, flights_delayed_15min_pct), Surface Queues (</w:t>
+      </w:r>
+      <w:proofErr w:type="spellStart"/>
+      <w:r>
+        <w:rPr>
+          <w:rFonts w:ascii="Times New Roman" w:eastAsia="Times New Roman" w:hAnsi="Times New Roman" w:cs="Times New Roman"/>
+          <w:color w:val="000000" w:themeColor="text1"/>
+          <w:kern w:val="0"/>
+          <w14:ligatures w14:val="none"/>
+        </w:rPr>
+        <w:t>avg_taxi_out_minutes</w:t>
+      </w:r>
+      <w:proofErr w:type="spellEnd"/>
+      <w:r>
+        <w:rPr>
+          <w:rFonts w:ascii="Times New Roman" w:eastAsia="Times New Roman" w:hAnsi="Times New Roman" w:cs="Times New Roman"/>
+          <w:color w:val="000000" w:themeColor="text1"/>
+          <w:kern w:val="0"/>
+          <w14:ligatures w14:val="none"/>
+        </w:rPr>
+        <w:t>), and Network Buffers (aircraft_gauge_seats, route_load_factor_pct, connecting_passenger_share_pct).</w:t>
       </w:r>
     </w:p>
     <w:p>
@@ -15255,7 +15384,27 @@
           <w:kern w:val="0"/>
           <w14:ligatures w14:val="none"/>
         </w:rPr>
-        <w:t>: Schedule Dispersion (sched_hourly_std, sched_hourly_cv, actual_hourly_std, actual_hourly_cv, sched_rolling_7d_std, sched_rolling_7d_cv), Cancellation Dispersion (cancel_rolling_7d_std, cancel_rate_rolling_7d_std, otp_cancellation_volatility_cv), and Delay Dispersion (otp_departure_delay_volatility_cv).</w:t>
+        <w:t>: Schedule Dispersion (sched_hourly_std, sched_hourly_cv, actual_hourly_std, actual_hourly_cv, sched_rolling_7d_std, sched_rolling_7d_cv), Cancellation Dispersion (cancel_rolling_7d_std, cancel_rate_rolling_7d_std, otp_cancellation_volatility_cv), and Delay Dispersion (</w:t>
+      </w:r>
+      <w:proofErr w:type="spellStart"/>
+      <w:r>
+        <w:rPr>
+          <w:rFonts w:ascii="Times New Roman" w:eastAsia="Times New Roman" w:hAnsi="Times New Roman" w:cs="Times New Roman"/>
+          <w:color w:val="000000" w:themeColor="text1"/>
+          <w:kern w:val="0"/>
+          <w14:ligatures w14:val="none"/>
+        </w:rPr>
+        <w:t>otp_departure_delay_volatility_cv</w:t>
+      </w:r>
+      <w:proofErr w:type="spellEnd"/>
+      <w:r>
+        <w:rPr>
+          <w:rFonts w:ascii="Times New Roman" w:eastAsia="Times New Roman" w:hAnsi="Times New Roman" w:cs="Times New Roman"/>
+          <w:color w:val="000000" w:themeColor="text1"/>
+          <w:kern w:val="0"/>
+          <w14:ligatures w14:val="none"/>
+        </w:rPr>
+        <w:t>).</w:t>
       </w:r>
     </w:p>
     <w:p>

</xml_diff>

<commit_message>
changed structure of tables and figures to make it for intuitive
</commit_message>
<xml_diff>
--- a/thesis_docs/manuscripts/ChpIII v2.docx
+++ b/thesis_docs/manuscripts/ChpIII v2.docx
@@ -653,7 +653,16 @@
                                   <w:kern w:val="0"/>
                                   <w14:ligatures w14:val="none"/>
                                 </w:rPr>
-                                <m:t>s+1</m:t>
+                                <m:t>s</m:t>
+                              </m:r>
+                              <m:r>
+                                <w:rPr>
+                                  <w:rFonts w:ascii="Cambria Math" w:eastAsia="Times New Roman" w:hAnsi="Cambria Math" w:cs="Times New Roman"/>
+                                  <w:color w:val="000000" w:themeColor="text1"/>
+                                  <w:kern w:val="0"/>
+                                  <w14:ligatures w14:val="none"/>
+                                </w:rPr>
+                                <m:t>+1</m:t>
                               </m:r>
                             </m:e>
                           </m:d>
@@ -700,7 +709,16 @@
                           <w:kern w:val="0"/>
                           <w14:ligatures w14:val="none"/>
                         </w:rPr>
-                        <m:t>1-ρ</m:t>
+                        <m:t>1-</m:t>
+                      </m:r>
+                      <m:r>
+                        <w:rPr>
+                          <w:rFonts w:ascii="Cambria Math" w:eastAsia="Times New Roman" w:hAnsi="Cambria Math" w:cs="Times New Roman"/>
+                          <w:color w:val="000000" w:themeColor="text1"/>
+                          <w:kern w:val="0"/>
+                          <w14:ligatures w14:val="none"/>
+                        </w:rPr>
+                        <m:t>ρ</m:t>
                       </m:r>
                     </m:e>
                   </m:d>
@@ -10452,6 +10470,7 @@
     <w:p>
       <w:pPr>
         <w:spacing w:after="0" w:line="480" w:lineRule="auto"/>
+        <w:ind w:firstLine="720"/>
         <w:contextualSpacing/>
         <w:rPr>
           <w:rFonts w:ascii="Times New Roman" w:eastAsia="Times New Roman" w:hAnsi="Times New Roman" w:cs="Times New Roman"/>
@@ -10638,6 +10657,7 @@
     <w:p>
       <w:pPr>
         <w:spacing w:after="0" w:line="480" w:lineRule="auto"/>
+        <w:ind w:firstLine="720"/>
         <w:contextualSpacing/>
         <w:rPr>
           <w:rFonts w:ascii="Times New Roman" w:eastAsia="Times New Roman" w:hAnsi="Times New Roman" w:cs="Times New Roman"/>
@@ -11191,7 +11211,16 @@
                           <w:kern w:val="0"/>
                           <w14:ligatures w14:val="none"/>
                         </w:rPr>
-                        <m:t>d,h</m:t>
+                        <m:t>d</m:t>
+                      </m:r>
+                      <m:r>
+                        <w:rPr>
+                          <w:rFonts w:ascii="Cambria Math" w:eastAsia="Times New Roman" w:hAnsi="Cambria Math" w:cs="Times New Roman"/>
+                          <w:color w:val="000000" w:themeColor="text1"/>
+                          <w:kern w:val="0"/>
+                          <w14:ligatures w14:val="none"/>
+                        </w:rPr>
+                        <m:t>,h</m:t>
                       </m:r>
                     </m:sub>
                   </m:sSub>
@@ -12374,7 +12403,16 @@
                       <w:kern w:val="0"/>
                       <w14:ligatures w14:val="none"/>
                     </w:rPr>
-                    <m:t>k=0</m:t>
+                    <m:t>k</m:t>
+                  </m:r>
+                  <m:r>
+                    <w:rPr>
+                      <w:rFonts w:ascii="Cambria Math" w:eastAsia="Times New Roman" w:hAnsi="Cambria Math" w:cs="Times New Roman"/>
+                      <w:color w:val="000000" w:themeColor="text1"/>
+                      <w:kern w:val="0"/>
+                      <w14:ligatures w14:val="none"/>
+                    </w:rPr>
+                    <m:t>=0</m:t>
                   </m:r>
                 </m:sub>
                 <m:sup>
@@ -12444,7 +12482,25 @@
                           <w:kern w:val="0"/>
                           <w14:ligatures w14:val="none"/>
                         </w:rPr>
-                        <m:t>d-k</m:t>
+                        <m:t>d</m:t>
+                      </m:r>
+                      <m:r>
+                        <w:rPr>
+                          <w:rFonts w:ascii="Cambria Math" w:eastAsia="Times New Roman" w:hAnsi="Cambria Math" w:cs="Times New Roman"/>
+                          <w:color w:val="000000" w:themeColor="text1"/>
+                          <w:kern w:val="0"/>
+                          <w14:ligatures w14:val="none"/>
+                        </w:rPr>
+                        <m:t>-</m:t>
+                      </m:r>
+                      <m:r>
+                        <w:rPr>
+                          <w:rFonts w:ascii="Cambria Math" w:eastAsia="Times New Roman" w:hAnsi="Cambria Math" w:cs="Times New Roman"/>
+                          <w:color w:val="000000" w:themeColor="text1"/>
+                          <w:kern w:val="0"/>
+                          <w14:ligatures w14:val="none"/>
+                        </w:rPr>
+                        <m:t>k</m:t>
                       </m:r>
                     </m:sub>
                   </m:sSub>
@@ -12502,7 +12558,16 @@
                           <w:kern w:val="0"/>
                           <w14:ligatures w14:val="none"/>
                         </w:rPr>
-                        <m:t>7d</m:t>
+                        <m:t>7</m:t>
+                      </m:r>
+                      <m:r>
+                        <w:rPr>
+                          <w:rFonts w:ascii="Cambria Math" w:eastAsia="Times New Roman" w:hAnsi="Cambria Math" w:cs="Times New Roman"/>
+                          <w:color w:val="000000" w:themeColor="text1"/>
+                          <w:kern w:val="0"/>
+                          <w14:ligatures w14:val="none"/>
+                        </w:rPr>
+                        <m:t>d</m:t>
                       </m:r>
                     </m:sub>
                   </m:sSub>
@@ -12755,7 +12820,16 @@
                   <w:kern w:val="0"/>
                   <w14:ligatures w14:val="none"/>
                 </w:rPr>
-                <m:t>,d</m:t>
+                <m:t>,</m:t>
+              </m:r>
+              <m:r>
+                <w:rPr>
+                  <w:rFonts w:ascii="Cambria Math" w:eastAsia="Times New Roman" w:hAnsi="Cambria Math" w:cs="Times New Roman"/>
+                  <w:color w:val="000000" w:themeColor="text1"/>
+                  <w:kern w:val="0"/>
+                  <w14:ligatures w14:val="none"/>
+                </w:rPr>
+                <m:t>d</m:t>
               </m:r>
             </m:sub>
           </m:sSub>
@@ -12872,7 +12946,16 @@
                       <w:kern w:val="0"/>
                       <w14:ligatures w14:val="none"/>
                     </w:rPr>
-                    <m:t>i=1</m:t>
+                    <m:t>i</m:t>
+                  </m:r>
+                  <m:r>
+                    <w:rPr>
+                      <w:rFonts w:ascii="Cambria Math" w:eastAsia="Times New Roman" w:hAnsi="Cambria Math" w:cs="Times New Roman"/>
+                      <w:color w:val="000000" w:themeColor="text1"/>
+                      <w:kern w:val="0"/>
+                      <w14:ligatures w14:val="none"/>
+                    </w:rPr>
+                    <m:t>=1</m:t>
                   </m:r>
                 </m:sub>
                 <m:sup>
@@ -12970,7 +13053,25 @@
                           <w:kern w:val="0"/>
                           <w14:ligatures w14:val="none"/>
                         </w:rPr>
-                        <m:t>d,i</m:t>
+                        <m:t>d</m:t>
+                      </m:r>
+                      <m:r>
+                        <w:rPr>
+                          <w:rFonts w:ascii="Cambria Math" w:eastAsia="Times New Roman" w:hAnsi="Cambria Math" w:cs="Times New Roman"/>
+                          <w:color w:val="000000" w:themeColor="text1"/>
+                          <w:kern w:val="0"/>
+                          <w14:ligatures w14:val="none"/>
+                        </w:rPr>
+                        <m:t>,</m:t>
+                      </m:r>
+                      <m:r>
+                        <w:rPr>
+                          <w:rFonts w:ascii="Cambria Math" w:eastAsia="Times New Roman" w:hAnsi="Cambria Math" w:cs="Times New Roman"/>
+                          <w:color w:val="000000" w:themeColor="text1"/>
+                          <w:kern w:val="0"/>
+                          <w14:ligatures w14:val="none"/>
+                        </w:rPr>
+                        <m:t>i</m:t>
                       </m:r>
                     </m:sub>
                   </m:sSub>
@@ -13208,7 +13309,16 @@
               <w:kern w:val="0"/>
               <w14:ligatures w14:val="none"/>
             </w:rPr>
-            <m:t>=C</m:t>
+            <m:t>=</m:t>
+          </m:r>
+          <m:r>
+            <w:rPr>
+              <w:rFonts w:ascii="Cambria Math" w:eastAsia="Times New Roman" w:hAnsi="Cambria Math" w:cs="Times New Roman"/>
+              <w:color w:val="000000" w:themeColor="text1"/>
+              <w:kern w:val="0"/>
+              <w14:ligatures w14:val="none"/>
+            </w:rPr>
+            <m:t>C</m:t>
           </m:r>
           <m:sSub>
             <m:sSubPr>
@@ -13252,7 +13362,16 @@
                   <w:kern w:val="0"/>
                   <w14:ligatures w14:val="none"/>
                 </w:rPr>
-                <m:t>,d</m:t>
+                <m:t>,</m:t>
+              </m:r>
+              <m:r>
+                <w:rPr>
+                  <w:rFonts w:ascii="Cambria Math" w:eastAsia="Times New Roman" w:hAnsi="Cambria Math" w:cs="Times New Roman"/>
+                  <w:color w:val="000000" w:themeColor="text1"/>
+                  <w:kern w:val="0"/>
+                  <w14:ligatures w14:val="none"/>
+                </w:rPr>
+                <m:t>d</m:t>
               </m:r>
             </m:sub>
           </m:sSub>
@@ -13307,7 +13426,16 @@
                   <w:kern w:val="0"/>
                   <w14:ligatures w14:val="none"/>
                 </w:rPr>
-                <m:t>,d</m:t>
+                <m:t>,</m:t>
+              </m:r>
+              <m:r>
+                <w:rPr>
+                  <w:rFonts w:ascii="Cambria Math" w:eastAsia="Times New Roman" w:hAnsi="Cambria Math" w:cs="Times New Roman"/>
+                  <w:color w:val="000000" w:themeColor="text1"/>
+                  <w:kern w:val="0"/>
+                  <w14:ligatures w14:val="none"/>
+                </w:rPr>
+                <m:t>d</m:t>
               </m:r>
             </m:sub>
           </m:sSub>
@@ -13612,7 +13740,16 @@
                               <w:kern w:val="0"/>
                               <w14:ligatures w14:val="none"/>
                             </w:rPr>
-                            <m:t>,dow</m:t>
+                            <m:t>,</m:t>
+                          </m:r>
+                          <m:r>
+                            <w:rPr>
+                              <w:rFonts w:ascii="Cambria Math" w:eastAsia="Times New Roman" w:hAnsi="Cambria Math" w:cs="Times New Roman"/>
+                              <w:color w:val="000000" w:themeColor="text1"/>
+                              <w:kern w:val="0"/>
+                              <w14:ligatures w14:val="none"/>
+                            </w:rPr>
+                            <m:t>dow</m:t>
                           </m:r>
                         </m:sub>
                       </m:sSub>
@@ -13720,7 +13857,16 @@
                               <w:kern w:val="0"/>
                               <w14:ligatures w14:val="none"/>
                             </w:rPr>
-                            <m:t>,dow</m:t>
+                            <m:t>,</m:t>
+                          </m:r>
+                          <m:r>
+                            <w:rPr>
+                              <w:rFonts w:ascii="Cambria Math" w:eastAsia="Times New Roman" w:hAnsi="Cambria Math" w:cs="Times New Roman"/>
+                              <w:color w:val="000000" w:themeColor="text1"/>
+                              <w:kern w:val="0"/>
+                              <w14:ligatures w14:val="none"/>
+                            </w:rPr>
+                            <m:t>dow</m:t>
                           </m:r>
                         </m:sub>
                       </m:sSub>
@@ -13831,7 +13977,16 @@
                                   <w:kern w:val="0"/>
                                   <w14:ligatures w14:val="none"/>
                                 </w:rPr>
-                                <m:t>,dow</m:t>
+                                <m:t>,</m:t>
+                              </m:r>
+                              <m:r>
+                                <w:rPr>
+                                  <w:rFonts w:ascii="Cambria Math" w:eastAsia="Times New Roman" w:hAnsi="Cambria Math" w:cs="Times New Roman"/>
+                                  <w:color w:val="000000" w:themeColor="text1"/>
+                                  <w:kern w:val="0"/>
+                                  <w14:ligatures w14:val="none"/>
+                                </w:rPr>
+                                <m:t>dow</m:t>
                               </m:r>
                             </m:sub>
                           </m:sSub>
@@ -13909,7 +14064,16 @@
                                   <w:kern w:val="0"/>
                                   <w14:ligatures w14:val="none"/>
                                 </w:rPr>
-                                <m:t>,dow</m:t>
+                                <m:t>,</m:t>
+                              </m:r>
+                              <m:r>
+                                <w:rPr>
+                                  <w:rFonts w:ascii="Cambria Math" w:eastAsia="Times New Roman" w:hAnsi="Cambria Math" w:cs="Times New Roman"/>
+                                  <w:color w:val="000000" w:themeColor="text1"/>
+                                  <w:kern w:val="0"/>
+                                  <w14:ligatures w14:val="none"/>
+                                </w:rPr>
+                                <m:t>dow</m:t>
                               </m:r>
                             </m:sub>
                           </m:sSub>
@@ -13939,6 +14103,15 @@
                         </m:e>
                       </m:d>
                       <m:r>
+                        <w:rPr>
+                          <w:rFonts w:ascii="Cambria Math" w:eastAsia="Times New Roman" w:hAnsi="Cambria Math" w:cs="Times New Roman"/>
+                          <w:color w:val="000000" w:themeColor="text1"/>
+                          <w:kern w:val="0"/>
+                          <w14:ligatures w14:val="none"/>
+                        </w:rPr>
+                        <m:t>⋅</m:t>
+                      </m:r>
+                      <m:r>
                         <m:rPr>
                           <m:scr m:val="double-struck"/>
                         </m:rPr>
@@ -13948,7 +14121,7 @@
                           <w:kern w:val="0"/>
                           <w14:ligatures w14:val="none"/>
                         </w:rPr>
-                        <m:t>⋅I</m:t>
+                        <m:t>I</m:t>
                       </m:r>
                       <m:d>
                         <m:dPr>
@@ -14152,7 +14325,16 @@
                                       <w:kern w:val="0"/>
                                       <w14:ligatures w14:val="none"/>
                                     </w:rPr>
-                                    <m:t>,dow</m:t>
+                                    <m:t>,</m:t>
+                                  </m:r>
+                                  <m:r>
+                                    <w:rPr>
+                                      <w:rFonts w:ascii="Cambria Math" w:eastAsia="Times New Roman" w:hAnsi="Cambria Math" w:cs="Times New Roman"/>
+                                      <w:color w:val="000000" w:themeColor="text1"/>
+                                      <w:kern w:val="0"/>
+                                      <w14:ligatures w14:val="none"/>
+                                    </w:rPr>
+                                    <m:t>dow</m:t>
                                   </m:r>
                                 </m:sub>
                               </m:sSub>
@@ -14230,7 +14412,16 @@
                                       <w:kern w:val="0"/>
                                       <w14:ligatures w14:val="none"/>
                                     </w:rPr>
-                                    <m:t>,dow</m:t>
+                                    <m:t>,</m:t>
+                                  </m:r>
+                                  <m:r>
+                                    <w:rPr>
+                                      <w:rFonts w:ascii="Cambria Math" w:eastAsia="Times New Roman" w:hAnsi="Cambria Math" w:cs="Times New Roman"/>
+                                      <w:color w:val="000000" w:themeColor="text1"/>
+                                      <w:kern w:val="0"/>
+                                      <w14:ligatures w14:val="none"/>
+                                    </w:rPr>
+                                    <m:t>dow</m:t>
                                   </m:r>
                                 </m:sub>
                               </m:sSub>
@@ -14260,6 +14451,15 @@
                             </m:e>
                           </m:d>
                           <m:r>
+                            <w:rPr>
+                              <w:rFonts w:ascii="Cambria Math" w:eastAsia="Times New Roman" w:hAnsi="Cambria Math" w:cs="Times New Roman"/>
+                              <w:color w:val="000000" w:themeColor="text1"/>
+                              <w:kern w:val="0"/>
+                              <w14:ligatures w14:val="none"/>
+                            </w:rPr>
+                            <m:t>⋅</m:t>
+                          </m:r>
+                          <m:r>
                             <m:rPr>
                               <m:scr m:val="double-struck"/>
                             </m:rPr>
@@ -14269,7 +14469,7 @@
                               <w:kern w:val="0"/>
                               <w14:ligatures w14:val="none"/>
                             </w:rPr>
-                            <m:t>⋅I</m:t>
+                            <m:t>I</m:t>
                           </m:r>
                           <m:d>
                             <m:dPr>

</xml_diff>